<commit_message>
docs(capstone): actualiza evidencias y documentacion Fase 2
</commit_message>
<xml_diff>
--- a/Fase 2/Evidencias Proyecto/Evidencias de documentación/CitaJusta_Requisitos_Funcionales_v0.2.docx
+++ b/Fase 2/Evidencias Proyecto/Evidencias de documentación/CitaJusta_Requisitos_Funcionales_v0.2.docx
@@ -1405,7 +1405,7 @@
         <w:rPr>
           <w:rtl w:val="0"/>
         </w:rPr>
-        <w:t>Definir las funciones que CitaJusta debe proporcionar a usuarios finales, funcionarios, profesionales y administradores, incluyendo las integraciones externas planificadas para la versión objetivo. Los requisitos servirán como entrada para el Product Backlog, las historias de usuario, los criterios de aceptación y las pruebas del proyecto.</w:t>
+        <w:t>Este documento identifica los requisitos funcionales de CitaJusta y sus vínculos con historias y criterios de aceptación. Tras la revisión del 16-10-2026, RF-039 a RF-042 están dentro del alcance implementado y RF-043 se conserva sólo como referencia histórica de un requisito formalmente excluido del entregable.</w:t>
       </w:r>
     </w:p>
     <w:p>
@@ -7972,7 +7972,7 @@
               <w:keepLines w:val="1"/>
             </w:pPr>
             <w:r>
-              <w:t>Permitir visualizar la ubicación real de una sede y facilitar una ruta mediante Google Maps usando dirección o coordenadas institucionales reales.</w:t>
+              <w:t>Permitir visualizar la ubicación de la sede con OpenStreetMap y acceder a indicaciones por enlaces de Google Maps con datos institucionales existentes; sin requerir APIs de Google Maps Platform.</w:t>
             </w:r>
           </w:p>
         </w:tc>
@@ -8029,7 +8029,7 @@
               <w:keepLines w:val="1"/>
             </w:pPr>
             <w:r>
-              <w:t>Notificaciones externas</w:t>
+              <w:t>Notificaciones externas — excluida</w:t>
             </w:r>
           </w:p>
         </w:tc>
@@ -8042,7 +8042,7 @@
               <w:keepLines w:val="1"/>
             </w:pPr>
             <w:r>
-              <w:t>Permitir enviar avisos seleccionados por WhatsApp a usuarios con consentimiento, sujeto a evaluación de proveedor/API, plantillas, costos y viabilidad.</w:t>
+              <w:t>REQUISITO RETIRADO del entregable desde 15-10-2026. La integración WhatsApp Cloud API fue descartada; se conserva el código RF-043 para trazabilidad, no como capacidad operativa.</w:t>
             </w:r>
           </w:p>
         </w:tc>
@@ -8068,7 +8068,7 @@
               <w:keepLines w:val="1"/>
             </w:pPr>
             <w:r>
-              <w:t>Objetivo</w:t>
+              <w:t>FUERA DE ALCANCE</w:t>
             </w:r>
           </w:p>
         </w:tc>
@@ -8082,7 +8082,7 @@
         <w:rPr>
           <w:rtl w:val="0"/>
         </w:rPr>
-        <w:t>Estas integraciones complementan las capacidades existentes y no reemplazan la lógica de dominio. CitaJusta/PostgreSQL continúa siendo la fuente de verdad de usuarios, citas, sedes, ofertas y reasignaciones. Los fallos de proveedores externos no deben convertir operaciones de negocio ya persistidas en estados ficticios. HU-043/RF-043 permanece condicionada a una decisión posterior de proveedor, consentimiento, plantillas, costos y viabilidad.</w:t>
+        <w:t>Resend (RF-039), Google OAuth/OIDC (RF-040), Google Calendar (RF-041) y visualización de sedes mediante OpenStreetMap/enlaces Google Maps (RF-042) complementan el dominio vigente. CitaJusta/PostgreSQL sigue siendo fuente de verdad. RF-043/WhatsApp quedó fuera del alcance entregable desde el 15-10-2026; conservar su identificador únicamente por trazabilidad del cambio.</w:t>
       </w:r>
     </w:p>
     <w:p>
@@ -8464,7 +8464,7 @@
         <w:rPr>
           <w:rtl w:val="0"/>
         </w:rPr>
-        <w:t xml:space="preserve">Cada requisito funcional deberá relacionarse posteriormente con uno o más Product Backlog Items. Durante la ejecución se registrará la relación Requisito -&gt; PBI/HU -&gt; Sprint -&gt; Pull Request -&gt; Prueba -&gt; Evidencia.</w:t>
+        <w:t>La relación RF → HU → PR → prueba/evidencia se conserva. HU-039–HU-042 tienen Issues cerradas y PR fusionadas; HU-043 está retirada aunque su Issue #165 figura como CLOSED COMPLETED, estado administrativo que no acredita implementación. La mejora visual del correo Resend V2 aún no está publicada ni validada visualmente en Gmail.</w:t>
       </w:r>
     </w:p>
     <w:p>
@@ -8487,7 +8487,21 @@
         <w:rPr>
           <w:rtl w:val="0"/>
         </w:rPr>
-        <w:t>Los requisitos funcionales establecen el comportamiento esperado de CitaJusta y protegen su propuesta de valor: transformar una cancelación en una nueva oportunidad de atención mediante una lista de espera activa y una reasignación segura y trazable. Las integraciones externas planificadas amplían canales de acceso, comunicación y apoyo al usuario sin desplazar a CitaJusta como fuente de verdad ni debilitar sus controles de autorización.</w:t>
+        <w:t>Los requisitos vigentes mantienen el flujo de citas, lista de espera y reasignación segura con autorización y trazabilidad. RF-039–RF-042 suman comunicación y apoyo externo sin reemplazar la fuente de verdad; RF-043 permanece documentado como exclusión de alcance, no como función pendiente de entrega.</w:t>
+      </w:r>
+    </w:p>
+    <w:p/>
+    <w:p>
+      <w:r>
+        <w:rPr>
+          <w:b/>
+        </w:rPr>
+        <w:t>Actualización documental — 16 de octubre de 2026</w:t>
+      </w:r>
+    </w:p>
+    <w:p>
+      <w:r>
+        <w:t>HU-043/RF-043 (WhatsApp Cloud API) fue excluida del alcance entregable el 15-10-2026 por restricciones empresariales del proveedor Meta en el contexto académico. La integración experimental se retiró del código; la PR documental #169 fue fusionada a main. La Issue #165 figura cerrada como COMPLETED, pero ese motivo de cierre no acredita implementación. No existe canal WhatsApp activo en la entrega. El cambio queda trazado en Scrum y decisiones técnicas; no se reescribe el historial del Sprint originalmente planificado.</w:t>
       </w:r>
     </w:p>
     <w:sectPr>

</xml_diff>